<commit_message>
Add author contributions, funding, competing interests, data availability
CRediT: VB (Conceptualization, Software, Validation, Writing-OD),
DC (Supervision, Writing-R&E, Funding). Competing interests: none.
Data availability: GitHub + Ensembl. Funding: placeholder for CSIR grants.
</commit_message>
<xml_diff>
--- a/paper/CRISPRArchitect_PLOS_manuscript.docx
+++ b/paper/CRISPRArchitect_PLOS_manuscript.docx
@@ -2332,39 +2332,119 @@
         </w:pict>
       </w:r>
     </w:p>
+    <w:bookmarkEnd w:id="44"/>
+    <w:bookmarkStart w:id="45" w:name="author-contributions"/>
+    <w:p>
+      <w:pPr>
+        <w:pStyle w:val="Heading1"/>
+      </w:pPr>
+      <w:r>
+        <w:t xml:space="preserve">AUTHOR CONTRIBUTIONS</w:t>
+      </w:r>
+    </w:p>
     <w:p>
       <w:pPr>
         <w:pStyle w:val="FirstParagraph"/>
       </w:pPr>
       <w:r>
+        <w:t xml:space="preserve">Conceptualization: VB. Software: VB. Validation: VB. Formal analysis: VB. Writing – original draft: VB. Writing – review &amp; editing: VB, DC. Supervision: DC. Funding acquisition: DC.</w:t>
+      </w:r>
+    </w:p>
+    <w:p>
+      <w:r>
+        <w:pict>
+          <v:rect style="width:0;height:1.5pt" o:hralign="center" o:hrstd="t" o:hr="t"/>
+        </w:pict>
+      </w:r>
+    </w:p>
+    <w:bookmarkEnd w:id="45"/>
+    <w:bookmarkStart w:id="46" w:name="funding"/>
+    <w:p>
+      <w:pPr>
+        <w:pStyle w:val="Heading1"/>
+      </w:pPr>
+      <w:r>
+        <w:t xml:space="preserve">FUNDING</w:t>
+      </w:r>
+    </w:p>
+    <w:p>
+      <w:pPr>
+        <w:pStyle w:val="FirstParagraph"/>
+      </w:pPr>
+      <w:r>
+        <w:t xml:space="preserve">This work was supported by [CSIR grant number(s) to be added by authors]. VB acknowledges [fellowship details to be added]. The funders had no role in study design, data collection and analysis, decision to publish, or preparation of the manuscript.</w:t>
+      </w:r>
+    </w:p>
+    <w:p>
+      <w:r>
+        <w:pict>
+          <v:rect style="width:0;height:1.5pt" o:hralign="center" o:hrstd="t" o:hr="t"/>
+        </w:pict>
+      </w:r>
+    </w:p>
+    <w:bookmarkEnd w:id="46"/>
+    <w:bookmarkStart w:id="47" w:name="competing-interests"/>
+    <w:p>
+      <w:pPr>
+        <w:pStyle w:val="Heading1"/>
+      </w:pPr>
+      <w:r>
+        <w:t xml:space="preserve">COMPETING INTERESTS</w:t>
+      </w:r>
+    </w:p>
+    <w:p>
+      <w:pPr>
+        <w:pStyle w:val="FirstParagraph"/>
+      </w:pPr>
+      <w:r>
+        <w:t xml:space="preserve">The authors declare no competing interests.</w:t>
+      </w:r>
+    </w:p>
+    <w:p>
+      <w:r>
+        <w:pict>
+          <v:rect style="width:0;height:1.5pt" o:hralign="center" o:hrstd="t" o:hr="t"/>
+        </w:pict>
+      </w:r>
+    </w:p>
+    <w:bookmarkEnd w:id="47"/>
+    <w:bookmarkStart w:id="48" w:name="data-availability-statement"/>
+    <w:p>
+      <w:pPr>
+        <w:pStyle w:val="Heading1"/>
+      </w:pPr>
+      <w:r>
+        <w:t xml:space="preserve">DATA AVAILABILITY STATEMENT</w:t>
+      </w:r>
+    </w:p>
+    <w:p>
+      <w:pPr>
+        <w:pStyle w:val="FirstParagraph"/>
+      </w:pPr>
+      <w:r>
+        <w:t xml:space="preserve">All source code, validation scripts, parameter files, and analysis pipelines are available at https://github.com/visvikbharti/CRISPRArchitect under the MIT license. The repository includes a Docker container for reproducible deployment. All gene coordinates were obtained from the Ensembl REST API (GRCh38 assembly). No novel experimental data were generated in this study; all validation comparisons use data from previously published studies cited in the manuscript.</w:t>
+      </w:r>
+    </w:p>
+    <w:p>
+      <w:r>
+        <w:pict>
+          <v:rect style="width:0;height:1.5pt" o:hralign="center" o:hrstd="t" o:hr="t"/>
+        </w:pict>
+      </w:r>
+    </w:p>
+    <w:p>
+      <w:pPr>
+        <w:pStyle w:val="FirstParagraph"/>
+      </w:pPr>
+      <w:r>
         <w:rPr>
           <w:iCs/>
           <w:i/>
         </w:rPr>
         <w:t xml:space="preserve">Manuscript prepared for PLOS Computational Biology, Research Article format.</w:t>
       </w:r>
-      <w:r>
-        <w:t xml:space="preserve"> </w:t>
-      </w:r>
-      <w:r>
-        <w:rPr>
-          <w:iCs/>
-          <w:i/>
-        </w:rPr>
-        <w:t xml:space="preserve">All citations require verification against original publications before submission.</w:t>
-      </w:r>
-      <w:r>
-        <w:t xml:space="preserve"> </w:t>
-      </w:r>
-      <w:r>
-        <w:rPr>
-          <w:iCs/>
-          <w:i/>
-        </w:rPr>
-        <w:t xml:space="preserve">Figures to be generated from validation scripts in the repository.</w:t>
-      </w:r>
-    </w:p>
-    <w:bookmarkEnd w:id="44"/>
+    </w:p>
+    <w:bookmarkEnd w:id="48"/>
     <w:sectPr/>
   </w:body>
 </w:document>

</xml_diff>

<commit_message>
Fix 6 reference errors found during verification
Critical fixes:
- Ref 13: Paquet et al. - 4th author corrected from "Bhatt S" to "Sproul A"
- Ref 14: Symington - year/vol/pages corrected from 2011;46:67-82 to 2016;51:195-212
- Ref 15: Cejka - journal corrected from Annu Rev Genet to J Biol Chem; 290:22931-22938
- Ref 19: Kan et al. - 3rd author corrected from "Taber S" to "Takasugi T"
- Ref 22: Aymard et al. - 5th author corrected from "Clapier P" to "Caron P"
- Ref 7: Xie et al. - expanded author list for PLOS style consistency

All 22 references now verified against PubMed. See REFERENCE_VERIFICATION.md.
</commit_message>
<xml_diff>
--- a/paper/CRISPRArchitect_PLOS_manuscript.docx
+++ b/paper/CRISPRArchitect_PLOS_manuscript.docx
@@ -1979,7 +1979,7 @@
         </w:numPr>
       </w:pPr>
       <w:r>
-        <w:t xml:space="preserve">Xie K, Starzyk J, Majumdar I, et al. Efficient non-viral immune cell engineering using circular single-stranded DNA-mediated genomic integration. Nat Biotechnol. 2025;43:1821-1832.</w:t>
+        <w:t xml:space="preserve">Xie K, Starzyk J, Majumdar I, Xiao K, Pham T, Wang YH, et al. Efficient non-viral immune cell engineering using circular single-stranded DNA-mediated genomic integration. Nat Biotechnol. 2025;43:1821-1832.</w:t>
       </w:r>
     </w:p>
     <w:p>
@@ -2045,7 +2045,7 @@
         </w:numPr>
       </w:pPr>
       <w:r>
-        <w:t xml:space="preserve">Paquet D, Kwart D, Chen A, Bhatt S, et al. Efficient introduction of specific homozygous and heterozygous mutations using CRISPR/Cas9. Nature. 2016;533:125-129.</w:t>
+        <w:t xml:space="preserve">Paquet D, Kwart D, Chen A, Sproul A, Jacob S, Teo S, et al. Efficient introduction of specific homozygous and heterozygous mutations using CRISPR/Cas9. Nature. 2016;533:125-129.</w:t>
       </w:r>
     </w:p>
     <w:p>
@@ -2056,7 +2056,7 @@
         </w:numPr>
       </w:pPr>
       <w:r>
-        <w:t xml:space="preserve">Symington LS. Mechanism and regulation of DNA end resection in eukaryotes. Crit Rev Biochem Mol Biol. 2011;46:67-82.</w:t>
+        <w:t xml:space="preserve">Symington LS. Mechanism and regulation of DNA end resection in eukaryotes. Crit Rev Biochem Mol Biol. 2016;51:195-212.</w:t>
       </w:r>
     </w:p>
     <w:p>
@@ -2067,7 +2067,7 @@
         </w:numPr>
       </w:pPr>
       <w:r>
-        <w:t xml:space="preserve">Cejka P. DNA end resection: nucleases team up with the right partners to initiate homologous recombination. Annu Rev Genet. 2015;49:399-420.</w:t>
+        <w:t xml:space="preserve">Cejka P. DNA end resection: nucleases team up with the right partners to initiate homologous recombination. J Biol Chem. 2015;290:22931-22938.</w:t>
       </w:r>
     </w:p>
     <w:p>
@@ -2111,7 +2111,7 @@
         </w:numPr>
       </w:pPr>
       <w:r>
-        <w:t xml:space="preserve">Kan Y, Ruis B, Taber S, Hendrickson EA. Mechanisms of precise genome editing using oligonucleotide donors. Genome Res. 2017;27:1099-1111.</w:t>
+        <w:t xml:space="preserve">Kan Y, Ruis B, Takasugi T, Hendrickson EA. Mechanisms of precise genome editing using oligonucleotide donors. Genome Res. 2017;27:1099-1111.</w:t>
       </w:r>
     </w:p>
     <w:p>
@@ -2144,7 +2144,7 @@
         </w:numPr>
       </w:pPr>
       <w:r>
-        <w:t xml:space="preserve">Aymard F, Bugler B, Schmidt CK, Guillou E, Clapier P, et al. Transcriptionally active chromatin recruits homologous recombination at DNA double-strand breaks. Nat Struct Mol Biol. 2014;21:366-374.</w:t>
+        <w:t xml:space="preserve">Aymard F, Bugler B, Schmidt CK, Guillou E, Caron P, et al. Transcriptionally active chromatin recruits homologous recombination at DNA double-strand breaks. Nat Struct Mol Biol. 2014;21:366-374.</w:t>
       </w:r>
     </w:p>
     <w:p>

</xml_diff>

<commit_message>
Final cross-check: remove format comments, clarify p_base description
- Removed instructional comments from Abstract and Author Summary headers
- Clarified that p_base=0.002 produces 350bp baseline, 540bp with modifiers
- All 22 references verified, all numbers cross-checked against simulations
</commit_message>
<xml_diff>
--- a/paper/CRISPRArchitect_PLOS_manuscript.docx
+++ b/paper/CRISPRArchitect_PLOS_manuscript.docx
@@ -156,14 +156,6 @@
         <w:pStyle w:val="FirstParagraph"/>
       </w:pPr>
       <w:r>
-        <w:t xml:space="preserve">(max 300 words; unstructured; no citations; no abbreviations first use)</w:t>
-      </w:r>
-    </w:p>
-    <w:p>
-      <w:pPr>
-        <w:pStyle w:val="BodyText"/>
-      </w:pPr>
-      <w:r>
         <w:t xml:space="preserve">Correcting multiple pathogenic mutations in large multi-exon genes using CRISPR-based technologies requires choosing among several editing modalities, including homology-directed repair with various donor formats, base editing, and prime editing. This decision is consequential in human induced pluripotent stem cells, where double-strand breaks trigger p53-dependent apoptosis, yet it is currently guided by intuition rather than quantitative analysis. Here we present a computational framework with two components. The first, ConversionSim, models homology-directed repair as a four-step stochastic process — end resection, RAD51 filament formation, strand invasion, and synthesis-dependent strand annealing — to predict gene conversion tract length distributions and the probability of incorporating donor-encoded edits at various distances from the double-strand break. The second, MOSAIC, enumerates all feasible editing strategies for a given multi-site correction problem and ranks them by predicted efficiency, safety, time, and cost. We calibrated ConversionSim using parameters from independent published studies and validated it against four experimental datasets. The model correctly predicted the approximately two-fold enhancement of circular over linear single-stranded DNA donors (predicted 2.07-fold versus observed 1.5-2.1-fold) and the enhancement from staggered nuclease cuts (predicted 1.82-fold versus observed 1.4-2.8-fold). It also revealed a systematic discrepancy for short oligonucleotide donors, attributable to the single-strand template repair pathway not captured by our synthesis-dependent strand annealing model. We benchmarked MOSAIC against strategies employed in 14 published genome editing studies, finding 71 percent concordance with expert decisions and complete agreement for base editing applications. The framework, available as open-source software, provides the first quantitative tool for comparing editing modalities in multi-site correction scenarios.</w:t>
       </w:r>
     </w:p>
@@ -187,14 +179,6 @@
     <w:p>
       <w:pPr>
         <w:pStyle w:val="FirstParagraph"/>
-      </w:pPr>
-      <w:r>
-        <w:t xml:space="preserve">(150-200 words; written for non-specialist scientists)</w:t>
-      </w:r>
-    </w:p>
-    <w:p>
-      <w:pPr>
-        <w:pStyle w:val="BodyText"/>
       </w:pPr>
       <w:r>
         <w:t xml:space="preserve">When patients carry two or more mutations in a single gene, correcting them using genome editing is not straightforward. Researchers must decide: should each mutation be fixed separately or simultaneously? Should they use traditional cut-and-paste repair, or newer approaches like base editing that change single DNA letters without cutting both strands? These choices matter enormously in patient-derived stem cells, where DNA cuts can trigger cell death.</w:t>
@@ -1477,7 +1461,7 @@
         <w:t xml:space="preserve"> </w:t>
       </w:r>
       <w:r>
-        <w:t xml:space="preserve">= 0.002 per bp (calibrated to produce median tracts of approximately 350 bp). For circular ssDNA donors,</w:t>
+        <w:t xml:space="preserve">= 0.002 per bp (producing baseline median tracts of approximately 350 bp before donor topology and stagger modifiers are applied; with cssDNA and staggered cuts, the effective median increases to approximately 540 bp). For circular ssDNA donors,</w:t>
       </w:r>
       <w:r>
         <w:t xml:space="preserve"> </w:t>

</xml_diff>